<commit_message>
subir act documentacion github
</commit_message>
<xml_diff>
--- a/ProgramacioIA/ejercicios/DocuemtnacionGithub.docx
+++ b/ProgramacioIA/ejercicios/DocuemtnacionGithub.docx
@@ -2,11 +2,344 @@
 <file path=word/document.xml><?xml version="1.0" encoding="utf-8"?>
 <w:document xmlns:wpc="http://schemas.microsoft.com/office/word/2010/wordprocessingCanvas" xmlns:cx="http://schemas.microsoft.com/office/drawing/2014/chartex" xmlns:cx1="http://schemas.microsoft.com/office/drawing/2015/9/8/chartex" xmlns:cx2="http://schemas.microsoft.com/office/drawing/2015/10/21/chartex" xmlns:cx3="http://schemas.microsoft.com/office/drawing/2016/5/9/chartex" xmlns:cx4="http://schemas.microsoft.com/office/drawing/2016/5/10/chartex" xmlns:cx5="http://schemas.microsoft.com/office/drawing/2016/5/11/chartex" xmlns:cx6="http://schemas.microsoft.com/office/drawing/2016/5/12/chartex" xmlns:cx7="http://schemas.microsoft.com/office/drawing/2016/5/13/chartex" xmlns:cx8="http://schemas.microsoft.com/office/drawing/2016/5/14/chartex" xmlns:mc="http://schemas.openxmlformats.org/markup-compatibility/2006" xmlns:aink="http://schemas.microsoft.com/office/drawing/2016/ink" xmlns:am3d="http://schemas.microsoft.com/office/drawing/2017/model3d" xmlns:o="urn:schemas-microsoft-com:office:office" xmlns:r="http://schemas.openxmlformats.org/officeDocument/2006/relationships" xmlns:m="http://schemas.openxmlformats.org/officeDocument/2006/math" xmlns:v="urn:schemas-microsoft-com:vml" xmlns:wp14="http://schemas.microsoft.com/office/word/2010/wordprocessingDrawing" xmlns:wp="http://schemas.openxmlformats.org/drawingml/2006/wordprocessingDrawing" xmlns:w10="urn:schemas-microsoft-com:office:word" xmlns:w="http://schemas.openxmlformats.org/wordprocessingml/2006/main" xmlns:w14="http://schemas.microsoft.com/office/word/2010/wordml" xmlns:w15="http://schemas.microsoft.com/office/word/2012/wordml" xmlns:w16cex="http://schemas.microsoft.com/office/word/2018/wordml/cex" xmlns:w16cid="http://schemas.microsoft.com/office/word/2016/wordml/cid" xmlns:w16="http://schemas.microsoft.com/office/word/2018/wordml" xmlns:w16sdtdh="http://schemas.microsoft.com/office/word/2020/wordml/sdtdatahash" xmlns:w16se="http://schemas.microsoft.com/office/word/2015/wordml/symex" xmlns:wpg="http://schemas.microsoft.com/office/word/2010/wordprocessingGroup" xmlns:wpi="http://schemas.microsoft.com/office/word/2010/wordprocessingInk" xmlns:wne="http://schemas.microsoft.com/office/word/2006/wordml" xmlns:wps="http://schemas.microsoft.com/office/word/2010/wordprocessingShape" mc:Ignorable="w14 w15 w16se w16cid w16 w16cex w16sdtdh wp14">
   <w:body>
+    <w:sdt>
+      <w:sdtPr>
+        <w:id w:val="-2080356502"/>
+        <w:docPartObj>
+          <w:docPartGallery w:val="Cover Pages"/>
+          <w:docPartUnique/>
+        </w:docPartObj>
+      </w:sdtPr>
+      <w:sdtContent>
+        <w:p>
+          <w:pPr>
+            <w:rPr>
+              <w:sz w:val="200"/>
+              <w:szCs w:val="200"/>
+            </w:rPr>
+          </w:pPr>
+          <w:r>
+            <w:rPr>
+              <w:noProof/>
+              <w:sz w:val="32"/>
+              <w:szCs w:val="28"/>
+            </w:rPr>
+            <mc:AlternateContent>
+              <mc:Choice Requires="wps">
+                <w:drawing>
+                  <wp:anchor distT="0" distB="0" distL="114300" distR="114300" simplePos="0" relativeHeight="251661312" behindDoc="0" locked="0" layoutInCell="1" allowOverlap="1" wp14:anchorId="3FE9862E" wp14:editId="0614E9D5">
+                    <wp:simplePos x="0" y="0"/>
+                    <wp:positionH relativeFrom="page">
+                      <wp:align>center</wp:align>
+                    </wp:positionH>
+                    <mc:AlternateContent>
+                      <mc:Choice Requires="wp14">
+                        <wp:positionV relativeFrom="page">
+                          <wp14:pctPosVOffset>81800</wp14:pctPosVOffset>
+                        </wp:positionV>
+                      </mc:Choice>
+                      <mc:Fallback>
+                        <wp:positionV relativeFrom="page">
+                          <wp:posOffset>8745855</wp:posOffset>
+                        </wp:positionV>
+                      </mc:Fallback>
+                    </mc:AlternateContent>
+                    <wp:extent cx="7315200" cy="914400"/>
+                    <wp:effectExtent l="0" t="0" r="0" b="8255"/>
+                    <wp:wrapSquare wrapText="bothSides"/>
+                    <wp:docPr id="152" name="Cuadro de texto 152"/>
+                    <wp:cNvGraphicFramePr/>
+                    <a:graphic xmlns:a="http://schemas.openxmlformats.org/drawingml/2006/main">
+                      <a:graphicData uri="http://schemas.microsoft.com/office/word/2010/wordprocessingShape">
+                        <wps:wsp>
+                          <wps:cNvSpPr txBox="1"/>
+                          <wps:spPr>
+                            <a:xfrm>
+                              <a:off x="0" y="0"/>
+                              <a:ext cx="7315200" cy="914400"/>
+                            </a:xfrm>
+                            <a:prstGeom prst="rect">
+                              <a:avLst/>
+                            </a:prstGeom>
+                            <a:noFill/>
+                            <a:ln w="6350">
+                              <a:noFill/>
+                            </a:ln>
+                            <a:effectLst/>
+                          </wps:spPr>
+                          <wps:style>
+                            <a:lnRef idx="0">
+                              <a:schemeClr val="accent1"/>
+                            </a:lnRef>
+                            <a:fillRef idx="0">
+                              <a:schemeClr val="accent1"/>
+                            </a:fillRef>
+                            <a:effectRef idx="0">
+                              <a:schemeClr val="accent1"/>
+                            </a:effectRef>
+                            <a:fontRef idx="minor">
+                              <a:schemeClr val="dk1"/>
+                            </a:fontRef>
+                          </wps:style>
+                          <wps:txbx>
+                            <w:txbxContent>
+                              <w:p>
+                                <w:pPr>
+                                  <w:pStyle w:val="Sinespaciado"/>
+                                  <w:jc w:val="right"/>
+                                  <w:rPr>
+                                    <w:color w:val="595959" w:themeColor="text1" w:themeTint="A6"/>
+                                    <w:sz w:val="28"/>
+                                    <w:szCs w:val="28"/>
+                                  </w:rPr>
+                                </w:pPr>
+                                <w:sdt>
+                                  <w:sdtPr>
+                                    <w:rPr>
+                                      <w:color w:val="595959" w:themeColor="text1" w:themeTint="A6"/>
+                                      <w:sz w:val="28"/>
+                                      <w:szCs w:val="28"/>
+                                    </w:rPr>
+                                    <w:alias w:val="Autor"/>
+                                    <w:tag w:val=""/>
+                                    <w:id w:val="789243997"/>
+                                    <w:dataBinding w:prefixMappings="xmlns:ns0='http://purl.org/dc/elements/1.1/' xmlns:ns1='http://schemas.openxmlformats.org/package/2006/metadata/core-properties' " w:xpath="/ns1:coreProperties[1]/ns0:creator[1]" w:storeItemID="{6C3C8BC8-F283-45AE-878A-BAB7291924A1}"/>
+                                    <w:text/>
+                                  </w:sdtPr>
+                                  <w:sdtContent>
+                                    <w:r>
+                                      <w:rPr>
+                                        <w:color w:val="595959" w:themeColor="text1" w:themeTint="A6"/>
+                                        <w:sz w:val="28"/>
+                                        <w:szCs w:val="28"/>
+                                      </w:rPr>
+                                      <w:t>Elias</w:t>
+                                    </w:r>
+                                  </w:sdtContent>
+                                </w:sdt>
+                                <w:r>
+                                  <w:rPr>
+                                    <w:color w:val="595959" w:themeColor="text1" w:themeTint="A6"/>
+                                    <w:sz w:val="28"/>
+                                    <w:szCs w:val="28"/>
+                                  </w:rPr>
+                                  <w:t xml:space="preserve"> </w:t>
+                                </w:r>
+                                <w:proofErr w:type="spellStart"/>
+                                <w:r>
+                                  <w:rPr>
+                                    <w:color w:val="595959" w:themeColor="text1" w:themeTint="A6"/>
+                                    <w:sz w:val="28"/>
+                                    <w:szCs w:val="28"/>
+                                  </w:rPr>
+                                  <w:t>Rafols</w:t>
+                                </w:r>
+                                <w:proofErr w:type="spellEnd"/>
+                                <w:r>
+                                  <w:rPr>
+                                    <w:color w:val="595959" w:themeColor="text1" w:themeTint="A6"/>
+                                    <w:sz w:val="28"/>
+                                    <w:szCs w:val="28"/>
+                                  </w:rPr>
+                                  <w:t xml:space="preserve"> Delgado</w:t>
+                                </w:r>
+                              </w:p>
+                              <w:p>
+                                <w:pPr>
+                                  <w:pStyle w:val="Sinespaciado"/>
+                                  <w:jc w:val="right"/>
+                                  <w:rPr>
+                                    <w:color w:val="595959" w:themeColor="text1" w:themeTint="A6"/>
+                                    <w:sz w:val="18"/>
+                                    <w:szCs w:val="18"/>
+                                  </w:rPr>
+                                </w:pPr>
+                                <w:sdt>
+                                  <w:sdtPr>
+                                    <w:rPr>
+                                      <w:color w:val="595959" w:themeColor="text1" w:themeTint="A6"/>
+                                      <w:sz w:val="18"/>
+                                      <w:szCs w:val="18"/>
+                                    </w:rPr>
+                                    <w:alias w:val="CorreoElectrónico"/>
+                                    <w:tag w:val="CorreoElectrónico"/>
+                                    <w:id w:val="942260680"/>
+                                    <w:dataBinding w:prefixMappings="xmlns:ns0='http://schemas.microsoft.com/office/2006/coverPageProps' " w:xpath="/ns0:CoverPageProperties[1]/ns0:CompanyEmail[1]" w:storeItemID="{55AF091B-3C7A-41E3-B477-F2FDAA23CFDA}"/>
+                                    <w:text/>
+                                  </w:sdtPr>
+                                  <w:sdtContent>
+                                    <w:r>
+                                      <w:rPr>
+                                        <w:color w:val="595959" w:themeColor="text1" w:themeTint="A6"/>
+                                        <w:sz w:val="18"/>
+                                        <w:szCs w:val="18"/>
+                                      </w:rPr>
+                                      <w:t>https://github.com/Elias032005/BigData-IA</w:t>
+                                    </w:r>
+                                  </w:sdtContent>
+                                </w:sdt>
+                              </w:p>
+                            </w:txbxContent>
+                          </wps:txbx>
+                          <wps:bodyPr rot="0" spcFirstLastPara="0" vertOverflow="overflow" horzOverflow="overflow" vert="horz" wrap="square" lIns="1600200" tIns="0" rIns="685800" bIns="0" numCol="1" spcCol="0" rtlCol="0" fromWordArt="0" anchor="b" anchorCtr="0" forceAA="0" compatLnSpc="1">
+                            <a:prstTxWarp prst="textNoShape">
+                              <a:avLst/>
+                            </a:prstTxWarp>
+                            <a:noAutofit/>
+                          </wps:bodyPr>
+                        </wps:wsp>
+                      </a:graphicData>
+                    </a:graphic>
+                    <wp14:sizeRelH relativeFrom="page">
+                      <wp14:pctWidth>94100</wp14:pctWidth>
+                    </wp14:sizeRelH>
+                    <wp14:sizeRelV relativeFrom="page">
+                      <wp14:pctHeight>9200</wp14:pctHeight>
+                    </wp14:sizeRelV>
+                  </wp:anchor>
+                </w:drawing>
+              </mc:Choice>
+              <mc:Fallback>
+                <w:pict>
+                  <v:shapetype w14:anchorId="3FE9862E" id="_x0000_t202" coordsize="21600,21600" o:spt="202" path="m,l,21600r21600,l21600,xe">
+                    <v:stroke joinstyle="miter"/>
+                    <v:path gradientshapeok="t" o:connecttype="rect"/>
+                  </v:shapetype>
+                  <v:shape id="Cuadro de texto 152" o:spid="_x0000_s1026" type="#_x0000_t202" style="position:absolute;margin-left:0;margin-top:0;width:8in;height:1in;z-index:251661312;visibility:visible;mso-wrap-style:square;mso-width-percent:941;mso-height-percent:92;mso-top-percent:818;mso-wrap-distance-left:9pt;mso-wrap-distance-top:0;mso-wrap-distance-right:9pt;mso-wrap-distance-bottom:0;mso-position-horizontal:center;mso-position-horizontal-relative:page;mso-position-vertical-relative:page;mso-width-percent:941;mso-height-percent:92;mso-top-percent:818;mso-width-relative:page;mso-height-relative:page;v-text-anchor:bottom" o:gfxdata="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" filled="f" stroked="f" strokeweight=".5pt">
+                    <v:textbox inset="126pt,0,54pt,0">
+                      <w:txbxContent>
+                        <w:p>
+                          <w:pPr>
+                            <w:pStyle w:val="Sinespaciado"/>
+                            <w:jc w:val="right"/>
+                            <w:rPr>
+                              <w:color w:val="595959" w:themeColor="text1" w:themeTint="A6"/>
+                              <w:sz w:val="28"/>
+                              <w:szCs w:val="28"/>
+                            </w:rPr>
+                          </w:pPr>
+                          <w:sdt>
+                            <w:sdtPr>
+                              <w:rPr>
+                                <w:color w:val="595959" w:themeColor="text1" w:themeTint="A6"/>
+                                <w:sz w:val="28"/>
+                                <w:szCs w:val="28"/>
+                              </w:rPr>
+                              <w:alias w:val="Autor"/>
+                              <w:tag w:val=""/>
+                              <w:id w:val="789243997"/>
+                              <w:dataBinding w:prefixMappings="xmlns:ns0='http://purl.org/dc/elements/1.1/' xmlns:ns1='http://schemas.openxmlformats.org/package/2006/metadata/core-properties' " w:xpath="/ns1:coreProperties[1]/ns0:creator[1]" w:storeItemID="{6C3C8BC8-F283-45AE-878A-BAB7291924A1}"/>
+                              <w:text/>
+                            </w:sdtPr>
+                            <w:sdtContent>
+                              <w:r>
+                                <w:rPr>
+                                  <w:color w:val="595959" w:themeColor="text1" w:themeTint="A6"/>
+                                  <w:sz w:val="28"/>
+                                  <w:szCs w:val="28"/>
+                                </w:rPr>
+                                <w:t>Elias</w:t>
+                              </w:r>
+                            </w:sdtContent>
+                          </w:sdt>
+                          <w:r>
+                            <w:rPr>
+                              <w:color w:val="595959" w:themeColor="text1" w:themeTint="A6"/>
+                              <w:sz w:val="28"/>
+                              <w:szCs w:val="28"/>
+                            </w:rPr>
+                            <w:t xml:space="preserve"> </w:t>
+                          </w:r>
+                          <w:proofErr w:type="spellStart"/>
+                          <w:r>
+                            <w:rPr>
+                              <w:color w:val="595959" w:themeColor="text1" w:themeTint="A6"/>
+                              <w:sz w:val="28"/>
+                              <w:szCs w:val="28"/>
+                            </w:rPr>
+                            <w:t>Rafols</w:t>
+                          </w:r>
+                          <w:proofErr w:type="spellEnd"/>
+                          <w:r>
+                            <w:rPr>
+                              <w:color w:val="595959" w:themeColor="text1" w:themeTint="A6"/>
+                              <w:sz w:val="28"/>
+                              <w:szCs w:val="28"/>
+                            </w:rPr>
+                            <w:t xml:space="preserve"> Delgado</w:t>
+                          </w:r>
+                        </w:p>
+                        <w:p>
+                          <w:pPr>
+                            <w:pStyle w:val="Sinespaciado"/>
+                            <w:jc w:val="right"/>
+                            <w:rPr>
+                              <w:color w:val="595959" w:themeColor="text1" w:themeTint="A6"/>
+                              <w:sz w:val="18"/>
+                              <w:szCs w:val="18"/>
+                            </w:rPr>
+                          </w:pPr>
+                          <w:sdt>
+                            <w:sdtPr>
+                              <w:rPr>
+                                <w:color w:val="595959" w:themeColor="text1" w:themeTint="A6"/>
+                                <w:sz w:val="18"/>
+                                <w:szCs w:val="18"/>
+                              </w:rPr>
+                              <w:alias w:val="CorreoElectrónico"/>
+                              <w:tag w:val="CorreoElectrónico"/>
+                              <w:id w:val="942260680"/>
+                              <w:dataBinding w:prefixMappings="xmlns:ns0='http://schemas.microsoft.com/office/2006/coverPageProps' " w:xpath="/ns0:CoverPageProperties[1]/ns0:CompanyEmail[1]" w:storeItemID="{55AF091B-3C7A-41E3-B477-F2FDAA23CFDA}"/>
+                              <w:text/>
+                            </w:sdtPr>
+                            <w:sdtContent>
+                              <w:r>
+                                <w:rPr>
+                                  <w:color w:val="595959" w:themeColor="text1" w:themeTint="A6"/>
+                                  <w:sz w:val="18"/>
+                                  <w:szCs w:val="18"/>
+                                </w:rPr>
+                                <w:t>https://github.com/Elias032005/BigData-IA</w:t>
+                              </w:r>
+                            </w:sdtContent>
+                          </w:sdt>
+                        </w:p>
+                      </w:txbxContent>
+                    </v:textbox>
+                    <w10:wrap type="square" anchorx="page" anchory="page"/>
+                  </v:shape>
+                </w:pict>
+              </mc:Fallback>
+            </mc:AlternateContent>
+          </w:r>
+          <w:r>
+            <w:rPr>
+              <w:sz w:val="72"/>
+              <w:szCs w:val="72"/>
+            </w:rPr>
+            <w:t>DOCUMENTACIÓN GITHUB</w:t>
+          </w:r>
+        </w:p>
+        <w:p>
+          <w:pPr>
+            <w:rPr>
+              <w:rFonts w:asciiTheme="majorHAnsi" w:eastAsiaTheme="majorEastAsia" w:hAnsiTheme="majorHAnsi" w:cstheme="majorBidi"/>
+              <w:sz w:val="36"/>
+              <w:szCs w:val="32"/>
+            </w:rPr>
+          </w:pPr>
+          <w:r>
+            <w:br w:type="page"/>
+          </w:r>
+        </w:p>
+      </w:sdtContent>
+    </w:sdt>
     <w:p>
       <w:pPr>
         <w:pStyle w:val="Ttulo1"/>
       </w:pPr>
       <w:r>
+        <w:lastRenderedPageBreak/>
         <w:t xml:space="preserve">Cuenta de </w:t>
       </w:r>
       <w:proofErr w:type="spellStart"/>
@@ -42,7 +375,7 @@
                     <pic:cNvPicPr/>
                   </pic:nvPicPr>
                   <pic:blipFill>
-                    <a:blip r:embed="rId5"/>
+                    <a:blip r:embed="rId6"/>
                     <a:stretch>
                       <a:fillRect/>
                     </a:stretch>
@@ -97,7 +430,7 @@
                     <pic:cNvPicPr/>
                   </pic:nvPicPr>
                   <pic:blipFill>
-                    <a:blip r:embed="rId6"/>
+                    <a:blip r:embed="rId7"/>
                     <a:stretch>
                       <a:fillRect/>
                     </a:stretch>
@@ -147,7 +480,7 @@
                     <pic:cNvPicPr/>
                   </pic:nvPicPr>
                   <pic:blipFill>
-                    <a:blip r:embed="rId7">
+                    <a:blip r:embed="rId8">
                       <a:extLst>
                         <a:ext uri="{28A0092B-C50C-407E-A947-70E740481C1C}">
                           <a14:useLocalDpi xmlns:a14="http://schemas.microsoft.com/office/drawing/2010/main" val="0"/>
@@ -193,6 +526,7 @@
         <w:pStyle w:val="Ttulo1"/>
       </w:pPr>
       <w:r>
+        <w:lastRenderedPageBreak/>
         <w:t>Configurar la conexión SSH</w:t>
       </w:r>
     </w:p>
@@ -278,7 +612,7 @@
                     <pic:cNvPicPr/>
                   </pic:nvPicPr>
                   <pic:blipFill>
-                    <a:blip r:embed="rId8"/>
+                    <a:blip r:embed="rId9"/>
                     <a:stretch>
                       <a:fillRect/>
                     </a:stretch>
@@ -320,7 +654,7 @@
                     <pic:cNvPicPr/>
                   </pic:nvPicPr>
                   <pic:blipFill>
-                    <a:blip r:embed="rId9"/>
+                    <a:blip r:embed="rId10"/>
                     <a:stretch>
                       <a:fillRect/>
                     </a:stretch>
@@ -345,7 +679,7 @@
       <w:r>
         <w:t>Nos vamos aquí (</w:t>
       </w:r>
-      <w:hyperlink r:id="rId10" w:history="1">
+      <w:hyperlink r:id="rId11" w:history="1">
         <w:r>
           <w:rPr>
             <w:rStyle w:val="Hipervnculo"/>
@@ -383,7 +717,7 @@
                     <pic:cNvPicPr/>
                   </pic:nvPicPr>
                   <pic:blipFill>
-                    <a:blip r:embed="rId11"/>
+                    <a:blip r:embed="rId12"/>
                     <a:stretch>
                       <a:fillRect/>
                     </a:stretch>
@@ -409,6 +743,7 @@
         <w:rPr>
           <w:noProof/>
         </w:rPr>
+        <w:lastRenderedPageBreak/>
         <w:drawing>
           <wp:inline distT="0" distB="0" distL="0" distR="0" wp14:anchorId="69795CFA" wp14:editId="5BDD2E70">
             <wp:extent cx="5400040" cy="2856865"/>
@@ -425,7 +760,7 @@
                     <pic:cNvPicPr/>
                   </pic:nvPicPr>
                   <pic:blipFill>
-                    <a:blip r:embed="rId12"/>
+                    <a:blip r:embed="rId13"/>
                     <a:stretch>
                       <a:fillRect/>
                     </a:stretch>
@@ -478,7 +813,7 @@
                     <pic:cNvPicPr/>
                   </pic:nvPicPr>
                   <pic:blipFill>
-                    <a:blip r:embed="rId13"/>
+                    <a:blip r:embed="rId14"/>
                     <a:stretch>
                       <a:fillRect/>
                     </a:stretch>
@@ -506,6 +841,7 @@
         <w:pStyle w:val="Ttulo1"/>
       </w:pPr>
       <w:r>
+        <w:lastRenderedPageBreak/>
         <w:t>Clonar el repositorio en local</w:t>
       </w:r>
     </w:p>
@@ -530,7 +866,7 @@
                     <pic:cNvPicPr/>
                   </pic:nvPicPr>
                   <pic:blipFill>
-                    <a:blip r:embed="rId14"/>
+                    <a:blip r:embed="rId15"/>
                     <a:stretch>
                       <a:fillRect/>
                     </a:stretch>
@@ -596,7 +932,7 @@
         </w:rPr>
         <w:t xml:space="preserve"> clone </w:t>
       </w:r>
-      <w:hyperlink r:id="rId15" w:history="1">
+      <w:hyperlink r:id="rId16" w:history="1">
         <w:r>
           <w:rPr>
             <w:rStyle w:val="Hipervnculo"/>
@@ -643,7 +979,7 @@
                     <pic:cNvPicPr/>
                   </pic:nvPicPr>
                   <pic:blipFill>
-                    <a:blip r:embed="rId16"/>
+                    <a:blip r:embed="rId17"/>
                     <a:stretch>
                       <a:fillRect/>
                     </a:stretch>
@@ -680,51 +1016,15 @@
     </w:p>
     <w:p>
       <w:r>
+        <w:rPr>
+          <w:noProof/>
+        </w:rPr>
+        <w:lastRenderedPageBreak/>
         <w:drawing>
           <wp:inline distT="0" distB="0" distL="0" distR="0" wp14:anchorId="3A679C37" wp14:editId="33E0CEE9">
             <wp:extent cx="4953691" cy="1733792"/>
             <wp:effectExtent l="0" t="0" r="0" b="0"/>
             <wp:docPr id="12" name="Imagen 12"/>
-            <wp:cNvGraphicFramePr>
-              <a:graphicFrameLocks xmlns:a="http://schemas.openxmlformats.org/drawingml/2006/main" noChangeAspect="1"/>
-            </wp:cNvGraphicFramePr>
-            <a:graphic xmlns:a="http://schemas.openxmlformats.org/drawingml/2006/main">
-              <a:graphicData uri="http://schemas.openxmlformats.org/drawingml/2006/picture">
-                <pic:pic xmlns:pic="http://schemas.openxmlformats.org/drawingml/2006/picture">
-                  <pic:nvPicPr>
-                    <pic:cNvPr id="1" name=""/>
-                    <pic:cNvPicPr/>
-                  </pic:nvPicPr>
-                  <pic:blipFill>
-                    <a:blip r:embed="rId17"/>
-                    <a:stretch>
-                      <a:fillRect/>
-                    </a:stretch>
-                  </pic:blipFill>
-                  <pic:spPr>
-                    <a:xfrm>
-                      <a:off x="0" y="0"/>
-                      <a:ext cx="4953691" cy="1733792"/>
-                    </a:xfrm>
-                    <a:prstGeom prst="rect">
-                      <a:avLst/>
-                    </a:prstGeom>
-                  </pic:spPr>
-                </pic:pic>
-              </a:graphicData>
-            </a:graphic>
-          </wp:inline>
-        </w:drawing>
-      </w:r>
-    </w:p>
-    <w:p>
-      <w:r>
-        <w:lastRenderedPageBreak/>
-        <w:drawing>
-          <wp:inline distT="0" distB="0" distL="0" distR="0" wp14:anchorId="63AE4DB6" wp14:editId="0FFF84F6">
-            <wp:extent cx="5400040" cy="6476365"/>
-            <wp:effectExtent l="0" t="0" r="0" b="635"/>
-            <wp:docPr id="13" name="Imagen 13"/>
             <wp:cNvGraphicFramePr>
               <a:graphicFrameLocks xmlns:a="http://schemas.openxmlformats.org/drawingml/2006/main" noChangeAspect="1"/>
             </wp:cNvGraphicFramePr>
@@ -744,7 +1044,7 @@
                   <pic:spPr>
                     <a:xfrm>
                       <a:off x="0" y="0"/>
-                      <a:ext cx="5400040" cy="6476365"/>
+                      <a:ext cx="4953691" cy="1733792"/>
                     </a:xfrm>
                     <a:prstGeom prst="rect">
                       <a:avLst/>
@@ -759,12 +1059,14 @@
     </w:p>
     <w:p>
       <w:r>
-        <w:lastRenderedPageBreak/>
+        <w:rPr>
+          <w:noProof/>
+        </w:rPr>
         <w:drawing>
-          <wp:inline distT="0" distB="0" distL="0" distR="0" wp14:anchorId="2EEA5028" wp14:editId="5044A3C2">
-            <wp:extent cx="5400040" cy="3505835"/>
-            <wp:effectExtent l="0" t="0" r="0" b="0"/>
-            <wp:docPr id="14" name="Imagen 14"/>
+          <wp:inline distT="0" distB="0" distL="0" distR="0" wp14:anchorId="63AE4DB6" wp14:editId="0FFF84F6">
+            <wp:extent cx="5400040" cy="6476365"/>
+            <wp:effectExtent l="0" t="0" r="0" b="635"/>
+            <wp:docPr id="13" name="Imagen 13"/>
             <wp:cNvGraphicFramePr>
               <a:graphicFrameLocks xmlns:a="http://schemas.openxmlformats.org/drawingml/2006/main" noChangeAspect="1"/>
             </wp:cNvGraphicFramePr>
@@ -784,6 +1086,49 @@
                   <pic:spPr>
                     <a:xfrm>
                       <a:off x="0" y="0"/>
+                      <a:ext cx="5400040" cy="6476365"/>
+                    </a:xfrm>
+                    <a:prstGeom prst="rect">
+                      <a:avLst/>
+                    </a:prstGeom>
+                  </pic:spPr>
+                </pic:pic>
+              </a:graphicData>
+            </a:graphic>
+          </wp:inline>
+        </w:drawing>
+      </w:r>
+    </w:p>
+    <w:p>
+      <w:r>
+        <w:rPr>
+          <w:noProof/>
+        </w:rPr>
+        <w:lastRenderedPageBreak/>
+        <w:drawing>
+          <wp:inline distT="0" distB="0" distL="0" distR="0" wp14:anchorId="2EEA5028" wp14:editId="5044A3C2">
+            <wp:extent cx="5400040" cy="3505835"/>
+            <wp:effectExtent l="0" t="0" r="0" b="0"/>
+            <wp:docPr id="14" name="Imagen 14"/>
+            <wp:cNvGraphicFramePr>
+              <a:graphicFrameLocks xmlns:a="http://schemas.openxmlformats.org/drawingml/2006/main" noChangeAspect="1"/>
+            </wp:cNvGraphicFramePr>
+            <a:graphic xmlns:a="http://schemas.openxmlformats.org/drawingml/2006/main">
+              <a:graphicData uri="http://schemas.openxmlformats.org/drawingml/2006/picture">
+                <pic:pic xmlns:pic="http://schemas.openxmlformats.org/drawingml/2006/picture">
+                  <pic:nvPicPr>
+                    <pic:cNvPr id="1" name=""/>
+                    <pic:cNvPicPr/>
+                  </pic:nvPicPr>
+                  <pic:blipFill>
+                    <a:blip r:embed="rId20"/>
+                    <a:stretch>
+                      <a:fillRect/>
+                    </a:stretch>
+                  </pic:blipFill>
+                  <pic:spPr>
+                    <a:xfrm>
+                      <a:off x="0" y="0"/>
                       <a:ext cx="5400040" cy="3505835"/>
                     </a:xfrm>
                     <a:prstGeom prst="rect">
@@ -800,10 +1145,115 @@
     <w:p/>
     <w:p/>
     <w:p/>
+    <w:p>
+      <w:pPr>
+        <w:pStyle w:val="Ttulo1"/>
+      </w:pPr>
+      <w:r>
+        <w:t>Subir los archivos trabajados hasta la fecha</w:t>
+      </w:r>
+    </w:p>
+    <w:p>
+      <w:r>
+        <w:drawing>
+          <wp:inline distT="0" distB="0" distL="0" distR="0" wp14:anchorId="1EFF1A91" wp14:editId="695C00F8">
+            <wp:extent cx="5400040" cy="3384550"/>
+            <wp:effectExtent l="0" t="0" r="0" b="6350"/>
+            <wp:docPr id="4" name="Imagen 4"/>
+            <wp:cNvGraphicFramePr>
+              <a:graphicFrameLocks xmlns:a="http://schemas.openxmlformats.org/drawingml/2006/main" noChangeAspect="1"/>
+            </wp:cNvGraphicFramePr>
+            <a:graphic xmlns:a="http://schemas.openxmlformats.org/drawingml/2006/main">
+              <a:graphicData uri="http://schemas.openxmlformats.org/drawingml/2006/picture">
+                <pic:pic xmlns:pic="http://schemas.openxmlformats.org/drawingml/2006/picture">
+                  <pic:nvPicPr>
+                    <pic:cNvPr id="1" name=""/>
+                    <pic:cNvPicPr/>
+                  </pic:nvPicPr>
+                  <pic:blipFill>
+                    <a:blip r:embed="rId21"/>
+                    <a:stretch>
+                      <a:fillRect/>
+                    </a:stretch>
+                  </pic:blipFill>
+                  <pic:spPr>
+                    <a:xfrm>
+                      <a:off x="0" y="0"/>
+                      <a:ext cx="5400040" cy="3384550"/>
+                    </a:xfrm>
+                    <a:prstGeom prst="rect">
+                      <a:avLst/>
+                    </a:prstGeom>
+                  </pic:spPr>
+                </pic:pic>
+              </a:graphicData>
+            </a:graphic>
+          </wp:inline>
+        </w:drawing>
+      </w:r>
+    </w:p>
+    <w:p/>
+    <w:p>
+      <w:pPr>
+        <w:pStyle w:val="Ttulo1"/>
+      </w:pPr>
+      <w:r>
+        <w:lastRenderedPageBreak/>
+        <w:t xml:space="preserve">Captura final del historial de </w:t>
+      </w:r>
+      <w:proofErr w:type="spellStart"/>
+      <w:r>
+        <w:t>commits</w:t>
+      </w:r>
+      <w:proofErr w:type="spellEnd"/>
+    </w:p>
+    <w:p>
+      <w:r>
+        <w:drawing>
+          <wp:inline distT="0" distB="0" distL="0" distR="0" wp14:anchorId="2EEDFED6" wp14:editId="7B5624FD">
+            <wp:extent cx="5077534" cy="657317"/>
+            <wp:effectExtent l="0" t="0" r="0" b="9525"/>
+            <wp:docPr id="15" name="Imagen 15"/>
+            <wp:cNvGraphicFramePr>
+              <a:graphicFrameLocks xmlns:a="http://schemas.openxmlformats.org/drawingml/2006/main" noChangeAspect="1"/>
+            </wp:cNvGraphicFramePr>
+            <a:graphic xmlns:a="http://schemas.openxmlformats.org/drawingml/2006/main">
+              <a:graphicData uri="http://schemas.openxmlformats.org/drawingml/2006/picture">
+                <pic:pic xmlns:pic="http://schemas.openxmlformats.org/drawingml/2006/picture">
+                  <pic:nvPicPr>
+                    <pic:cNvPr id="1" name=""/>
+                    <pic:cNvPicPr/>
+                  </pic:nvPicPr>
+                  <pic:blipFill>
+                    <a:blip r:embed="rId22"/>
+                    <a:stretch>
+                      <a:fillRect/>
+                    </a:stretch>
+                  </pic:blipFill>
+                  <pic:spPr>
+                    <a:xfrm>
+                      <a:off x="0" y="0"/>
+                      <a:ext cx="5077534" cy="657317"/>
+                    </a:xfrm>
+                    <a:prstGeom prst="rect">
+                      <a:avLst/>
+                    </a:prstGeom>
+                  </pic:spPr>
+                </pic:pic>
+              </a:graphicData>
+            </a:graphic>
+          </wp:inline>
+        </w:drawing>
+      </w:r>
+    </w:p>
+    <w:p/>
+    <w:p/>
     <w:sectPr>
       <w:pgSz w:w="11906" w:h="16838"/>
       <w:pgMar w:top="1417" w:right="1701" w:bottom="1417" w:left="1701" w:header="708" w:footer="708" w:gutter="0"/>
+      <w:pgNumType w:start="0"/>
       <w:cols w:space="708"/>
+      <w:titlePg/>
       <w:docGrid w:linePitch="360"/>
     </w:sectPr>
   </w:body>
@@ -1404,6 +1854,31 @@
       <w:shd w:val="clear" w:color="auto" w:fill="E1DFDD"/>
     </w:rPr>
   </w:style>
+  <w:style w:type="paragraph" w:styleId="Sinespaciado">
+    <w:name w:val="No Spacing"/>
+    <w:link w:val="SinespaciadoCar"/>
+    <w:uiPriority w:val="1"/>
+    <w:qFormat/>
+    <w:rsid w:val="003548CB"/>
+    <w:pPr>
+      <w:spacing w:after="0" w:line="240" w:lineRule="auto"/>
+    </w:pPr>
+    <w:rPr>
+      <w:rFonts w:eastAsiaTheme="minorEastAsia"/>
+      <w:lang w:eastAsia="es-ES"/>
+    </w:rPr>
+  </w:style>
+  <w:style w:type="character" w:customStyle="1" w:styleId="SinespaciadoCar">
+    <w:name w:val="Sin espaciado Car"/>
+    <w:basedOn w:val="Fuentedeprrafopredeter"/>
+    <w:link w:val="Sinespaciado"/>
+    <w:uiPriority w:val="1"/>
+    <w:rsid w:val="003548CB"/>
+    <w:rPr>
+      <w:rFonts w:eastAsiaTheme="minorEastAsia"/>
+      <w:lang w:eastAsia="es-ES"/>
+    </w:rPr>
+  </w:style>
 </w:styles>
 </file>
 
@@ -1700,4 +2175,23 @@
     </a:ext>
   </a:extLst>
 </a:theme>
+</file>
+
+<file path=customXml/item1.xml><?xml version="1.0" encoding="utf-8"?>
+<CoverPageProperties xmlns="http://schemas.microsoft.com/office/2006/coverPageProps">
+  <PublishDate/>
+  <Abstract/>
+  <CompanyAddress/>
+  <CompanyPhone/>
+  <CompanyFax/>
+  <CompanyEmail>https://github.com/Elias032005/BigData-IA</CompanyEmail>
+</CoverPageProperties>
+</file>
+
+<file path=customXml/itemProps1.xml><?xml version="1.0" encoding="utf-8"?>
+<ds:datastoreItem xmlns:ds="http://schemas.openxmlformats.org/officeDocument/2006/customXml" ds:itemID="{55AF091B-3C7A-41E3-B477-F2FDAA23CFDA}">
+  <ds:schemaRefs>
+    <ds:schemaRef ds:uri="http://schemas.microsoft.com/office/2006/coverPageProps"/>
+  </ds:schemaRefs>
+</ds:datastoreItem>
 </file>
</xml_diff>